<commit_message>
e4 l5 and Master CSS DEMO
</commit_message>
<xml_diff>
--- a/e2/int250-B1-02-E2-RP-Tunyakan-Atcharayu.docx
+++ b/e2/int250-B1-02-E2-RP-Tunyakan-Atcharayu.docx
@@ -574,7 +574,12 @@
           <w:szCs w:val="36"/>
         </w:rPr>
         <w:sectPr>
-          <w:footerReference w:type="default" r:id="rId10"/>
+          <w:headerReference w:type="even" r:id="rId10"/>
+          <w:headerReference w:type="default" r:id="rId11"/>
+          <w:footerReference w:type="even" r:id="rId12"/>
+          <w:footerReference w:type="default" r:id="rId13"/>
+          <w:headerReference w:type="first" r:id="rId14"/>
+          <w:footerReference w:type="first" r:id="rId15"/>
           <w:pgSz w:w="11906" w:h="16838" w:code="9"/>
           <w:pgMar w:top="1440" w:right="1440" w:bottom="1440" w:left="1440" w:header="720" w:footer="720" w:gutter="0"/>
           <w:cols w:space="720"/>
@@ -3125,8 +3130,8 @@
           <w:cs/>
         </w:rPr>
         <w:sectPr>
-          <w:headerReference w:type="default" r:id="rId11"/>
-          <w:footerReference w:type="default" r:id="rId12"/>
+          <w:headerReference w:type="default" r:id="rId16"/>
+          <w:footerReference w:type="default" r:id="rId17"/>
           <w:pgSz w:w="11906" w:h="16838" w:code="9"/>
           <w:pgMar w:top="720" w:right="720" w:bottom="720" w:left="720" w:header="720" w:footer="720" w:gutter="0"/>
           <w:pgNumType w:start="1"/>
@@ -3858,13 +3863,33 @@
   <w:p>
     <w:pPr>
       <w:pStyle w:val="Footer"/>
+    </w:pPr>
+  </w:p>
+</w:ftr>
+</file>
+
+<file path=word/footer2.xml><?xml version="1.0" encoding="utf-8"?>
+<w:ftr xmlns:wpc="http://schemas.microsoft.com/office/word/2010/wordprocessingCanvas" xmlns:cx="http://schemas.microsoft.com/office/drawing/2014/chartex" xmlns:cx1="http://schemas.microsoft.com/office/drawing/2015/9/8/chartex" xmlns:cx2="http://schemas.microsoft.com/office/drawing/2015/10/21/chartex" xmlns:cx3="http://schemas.microsoft.com/office/drawing/2016/5/9/chartex" xmlns:cx4="http://schemas.microsoft.com/office/drawing/2016/5/10/chartex" xmlns:cx5="http://schemas.microsoft.com/office/drawing/2016/5/11/chartex" xmlns:cx6="http://schemas.microsoft.com/office/drawing/2016/5/12/chartex" xmlns:cx7="http://schemas.microsoft.com/office/drawing/2016/5/13/chartex" xmlns:cx8="http://schemas.microsoft.com/office/drawing/2016/5/14/chartex" xmlns:mc="http://schemas.openxmlformats.org/markup-compatibility/2006" xmlns:aink="http://schemas.microsoft.com/office/drawing/2016/ink" xmlns:am3d="http://schemas.microsoft.com/office/drawing/2017/model3d" xmlns:o="urn:schemas-microsoft-com:office:office" xmlns:oel="http://schemas.microsoft.com/office/2019/extlst" xmlns:r="http://schemas.openxmlformats.org/officeDocument/2006/relationships" xmlns:m="http://schemas.openxmlformats.org/officeDocument/2006/math" xmlns:v="urn:schemas-microsoft-com:vml" xmlns:wp14="http://schemas.microsoft.com/office/word/2010/wordprocessingDrawing" xmlns:wp="http://schemas.openxmlformats.org/drawingml/2006/wordprocessingDrawing" xmlns:w10="urn:schemas-microsoft-com:office:word" xmlns:w="http://schemas.openxmlformats.org/wordprocessingml/2006/main" xmlns:w14="http://schemas.microsoft.com/office/word/2010/wordml" xmlns:w15="http://schemas.microsoft.com/office/word/2012/wordml" xmlns:w16cex="http://schemas.microsoft.com/office/word/2018/wordml/cex" xmlns:w16cid="http://schemas.microsoft.com/office/word/2016/wordml/cid" xmlns:w16="http://schemas.microsoft.com/office/word/2018/wordml" xmlns:w16du="http://schemas.microsoft.com/office/word/2023/wordml/word16du" xmlns:w16sdtdh="http://schemas.microsoft.com/office/word/2020/wordml/sdtdatahash" xmlns:w16sdtfl="http://schemas.microsoft.com/office/word/2024/wordml/sdtformatlock" xmlns:w16se="http://schemas.microsoft.com/office/word/2015/wordml/symex" xmlns:wpg="http://schemas.microsoft.com/office/word/2010/wordprocessingGroup" xmlns:wpi="http://schemas.microsoft.com/office/word/2010/wordprocessingInk" xmlns:wne="http://schemas.microsoft.com/office/word/2006/wordml" xmlns:wps="http://schemas.microsoft.com/office/word/2010/wordprocessingShape" mc:Ignorable="w14 w15 w16se w16cid w16 w16cex w16sdtdh w16sdtfl w16du wp14">
+  <w:p>
+    <w:pPr>
+      <w:pStyle w:val="Footer"/>
       <w:jc w:val="center"/>
     </w:pPr>
   </w:p>
 </w:ftr>
 </file>
 
-<file path=word/footer2.xml><?xml version="1.0" encoding="utf-8"?>
+<file path=word/footer3.xml><?xml version="1.0" encoding="utf-8"?>
+<w:ftr xmlns:wpc="http://schemas.microsoft.com/office/word/2010/wordprocessingCanvas" xmlns:cx="http://schemas.microsoft.com/office/drawing/2014/chartex" xmlns:cx1="http://schemas.microsoft.com/office/drawing/2015/9/8/chartex" xmlns:cx2="http://schemas.microsoft.com/office/drawing/2015/10/21/chartex" xmlns:cx3="http://schemas.microsoft.com/office/drawing/2016/5/9/chartex" xmlns:cx4="http://schemas.microsoft.com/office/drawing/2016/5/10/chartex" xmlns:cx5="http://schemas.microsoft.com/office/drawing/2016/5/11/chartex" xmlns:cx6="http://schemas.microsoft.com/office/drawing/2016/5/12/chartex" xmlns:cx7="http://schemas.microsoft.com/office/drawing/2016/5/13/chartex" xmlns:cx8="http://schemas.microsoft.com/office/drawing/2016/5/14/chartex" xmlns:mc="http://schemas.openxmlformats.org/markup-compatibility/2006" xmlns:aink="http://schemas.microsoft.com/office/drawing/2016/ink" xmlns:am3d="http://schemas.microsoft.com/office/drawing/2017/model3d" xmlns:o="urn:schemas-microsoft-com:office:office" xmlns:oel="http://schemas.microsoft.com/office/2019/extlst" xmlns:r="http://schemas.openxmlformats.org/officeDocument/2006/relationships" xmlns:m="http://schemas.openxmlformats.org/officeDocument/2006/math" xmlns:v="urn:schemas-microsoft-com:vml" xmlns:wp14="http://schemas.microsoft.com/office/word/2010/wordprocessingDrawing" xmlns:wp="http://schemas.openxmlformats.org/drawingml/2006/wordprocessingDrawing" xmlns:w10="urn:schemas-microsoft-com:office:word" xmlns:w="http://schemas.openxmlformats.org/wordprocessingml/2006/main" xmlns:w14="http://schemas.microsoft.com/office/word/2010/wordml" xmlns:w15="http://schemas.microsoft.com/office/word/2012/wordml" xmlns:w16cex="http://schemas.microsoft.com/office/word/2018/wordml/cex" xmlns:w16cid="http://schemas.microsoft.com/office/word/2016/wordml/cid" xmlns:w16="http://schemas.microsoft.com/office/word/2018/wordml" xmlns:w16du="http://schemas.microsoft.com/office/word/2023/wordml/word16du" xmlns:w16sdtdh="http://schemas.microsoft.com/office/word/2020/wordml/sdtdatahash" xmlns:w16sdtfl="http://schemas.microsoft.com/office/word/2024/wordml/sdtformatlock" xmlns:w16se="http://schemas.microsoft.com/office/word/2015/wordml/symex" xmlns:wpg="http://schemas.microsoft.com/office/word/2010/wordprocessingGroup" xmlns:wpi="http://schemas.microsoft.com/office/word/2010/wordprocessingInk" xmlns:wne="http://schemas.microsoft.com/office/word/2006/wordml" xmlns:wps="http://schemas.microsoft.com/office/word/2010/wordprocessingShape" mc:Ignorable="w14 w15 w16se w16cid w16 w16cex w16sdtdh w16sdtfl w16du wp14">
+  <w:p>
+    <w:pPr>
+      <w:pStyle w:val="Footer"/>
+    </w:pPr>
+  </w:p>
+</w:ftr>
+</file>
+
+<file path=word/footer4.xml><?xml version="1.0" encoding="utf-8"?>
 <w:ftr xmlns:wpc="http://schemas.microsoft.com/office/word/2010/wordprocessingCanvas" xmlns:cx="http://schemas.microsoft.com/office/drawing/2014/chartex" xmlns:cx1="http://schemas.microsoft.com/office/drawing/2015/9/8/chartex" xmlns:cx2="http://schemas.microsoft.com/office/drawing/2015/10/21/chartex" xmlns:cx3="http://schemas.microsoft.com/office/drawing/2016/5/9/chartex" xmlns:cx4="http://schemas.microsoft.com/office/drawing/2016/5/10/chartex" xmlns:cx5="http://schemas.microsoft.com/office/drawing/2016/5/11/chartex" xmlns:cx6="http://schemas.microsoft.com/office/drawing/2016/5/12/chartex" xmlns:cx7="http://schemas.microsoft.com/office/drawing/2016/5/13/chartex" xmlns:cx8="http://schemas.microsoft.com/office/drawing/2016/5/14/chartex" xmlns:mc="http://schemas.openxmlformats.org/markup-compatibility/2006" xmlns:aink="http://schemas.microsoft.com/office/drawing/2016/ink" xmlns:am3d="http://schemas.microsoft.com/office/drawing/2017/model3d" xmlns:o="urn:schemas-microsoft-com:office:office" xmlns:oel="http://schemas.microsoft.com/office/2019/extlst" xmlns:r="http://schemas.openxmlformats.org/officeDocument/2006/relationships" xmlns:m="http://schemas.openxmlformats.org/officeDocument/2006/math" xmlns:v="urn:schemas-microsoft-com:vml" xmlns:wp14="http://schemas.microsoft.com/office/word/2010/wordprocessingDrawing" xmlns:wp="http://schemas.openxmlformats.org/drawingml/2006/wordprocessingDrawing" xmlns:w10="urn:schemas-microsoft-com:office:word" xmlns:w="http://schemas.openxmlformats.org/wordprocessingml/2006/main" xmlns:w14="http://schemas.microsoft.com/office/word/2010/wordml" xmlns:w15="http://schemas.microsoft.com/office/word/2012/wordml" xmlns:w16cex="http://schemas.microsoft.com/office/word/2018/wordml/cex" xmlns:w16cid="http://schemas.microsoft.com/office/word/2016/wordml/cid" xmlns:w16="http://schemas.microsoft.com/office/word/2018/wordml" xmlns:w16du="http://schemas.microsoft.com/office/word/2023/wordml/word16du" xmlns:w16sdtdh="http://schemas.microsoft.com/office/word/2020/wordml/sdtdatahash" xmlns:w16sdtfl="http://schemas.microsoft.com/office/word/2024/wordml/sdtformatlock" xmlns:w16se="http://schemas.microsoft.com/office/word/2015/wordml/symex" xmlns:wpg="http://schemas.microsoft.com/office/word/2010/wordprocessingGroup" xmlns:wpi="http://schemas.microsoft.com/office/word/2010/wordprocessingInk" xmlns:wne="http://schemas.microsoft.com/office/word/2006/wordml" xmlns:wps="http://schemas.microsoft.com/office/word/2010/wordprocessingShape" mc:Ignorable="w14 w15 w16se w16cid w16 w16cex w16sdtdh w16sdtfl w16du wp14">
   <w:sdt>
     <w:sdtPr>
@@ -3962,6 +3987,36 @@
 <w:hdr xmlns:wpc="http://schemas.microsoft.com/office/word/2010/wordprocessingCanvas" xmlns:cx="http://schemas.microsoft.com/office/drawing/2014/chartex" xmlns:cx1="http://schemas.microsoft.com/office/drawing/2015/9/8/chartex" xmlns:cx2="http://schemas.microsoft.com/office/drawing/2015/10/21/chartex" xmlns:cx3="http://schemas.microsoft.com/office/drawing/2016/5/9/chartex" xmlns:cx4="http://schemas.microsoft.com/office/drawing/2016/5/10/chartex" xmlns:cx5="http://schemas.microsoft.com/office/drawing/2016/5/11/chartex" xmlns:cx6="http://schemas.microsoft.com/office/drawing/2016/5/12/chartex" xmlns:cx7="http://schemas.microsoft.com/office/drawing/2016/5/13/chartex" xmlns:cx8="http://schemas.microsoft.com/office/drawing/2016/5/14/chartex" xmlns:mc="http://schemas.openxmlformats.org/markup-compatibility/2006" xmlns:aink="http://schemas.microsoft.com/office/drawing/2016/ink" xmlns:am3d="http://schemas.microsoft.com/office/drawing/2017/model3d" xmlns:o="urn:schemas-microsoft-com:office:office" xmlns:oel="http://schemas.microsoft.com/office/2019/extlst" xmlns:r="http://schemas.openxmlformats.org/officeDocument/2006/relationships" xmlns:m="http://schemas.openxmlformats.org/officeDocument/2006/math" xmlns:v="urn:schemas-microsoft-com:vml" xmlns:wp14="http://schemas.microsoft.com/office/word/2010/wordprocessingDrawing" xmlns:wp="http://schemas.openxmlformats.org/drawingml/2006/wordprocessingDrawing" xmlns:w10="urn:schemas-microsoft-com:office:word" xmlns:w="http://schemas.openxmlformats.org/wordprocessingml/2006/main" xmlns:w14="http://schemas.microsoft.com/office/word/2010/wordml" xmlns:w15="http://schemas.microsoft.com/office/word/2012/wordml" xmlns:w16cex="http://schemas.microsoft.com/office/word/2018/wordml/cex" xmlns:w16cid="http://schemas.microsoft.com/office/word/2016/wordml/cid" xmlns:w16="http://schemas.microsoft.com/office/word/2018/wordml" xmlns:w16du="http://schemas.microsoft.com/office/word/2023/wordml/word16du" xmlns:w16sdtdh="http://schemas.microsoft.com/office/word/2020/wordml/sdtdatahash" xmlns:w16sdtfl="http://schemas.microsoft.com/office/word/2024/wordml/sdtformatlock" xmlns:w16se="http://schemas.microsoft.com/office/word/2015/wordml/symex" xmlns:wpg="http://schemas.microsoft.com/office/word/2010/wordprocessingGroup" xmlns:wpi="http://schemas.microsoft.com/office/word/2010/wordprocessingInk" xmlns:wne="http://schemas.microsoft.com/office/word/2006/wordml" xmlns:wps="http://schemas.microsoft.com/office/word/2010/wordprocessingShape" mc:Ignorable="w14 w15 w16se w16cid w16 w16cex w16sdtdh w16sdtfl w16du wp14">
   <w:p>
     <w:pPr>
+      <w:pStyle w:val="Header"/>
+    </w:pPr>
+  </w:p>
+</w:hdr>
+</file>
+
+<file path=word/header2.xml><?xml version="1.0" encoding="utf-8"?>
+<w:hdr xmlns:wpc="http://schemas.microsoft.com/office/word/2010/wordprocessingCanvas" xmlns:cx="http://schemas.microsoft.com/office/drawing/2014/chartex" xmlns:cx1="http://schemas.microsoft.com/office/drawing/2015/9/8/chartex" xmlns:cx2="http://schemas.microsoft.com/office/drawing/2015/10/21/chartex" xmlns:cx3="http://schemas.microsoft.com/office/drawing/2016/5/9/chartex" xmlns:cx4="http://schemas.microsoft.com/office/drawing/2016/5/10/chartex" xmlns:cx5="http://schemas.microsoft.com/office/drawing/2016/5/11/chartex" xmlns:cx6="http://schemas.microsoft.com/office/drawing/2016/5/12/chartex" xmlns:cx7="http://schemas.microsoft.com/office/drawing/2016/5/13/chartex" xmlns:cx8="http://schemas.microsoft.com/office/drawing/2016/5/14/chartex" xmlns:mc="http://schemas.openxmlformats.org/markup-compatibility/2006" xmlns:aink="http://schemas.microsoft.com/office/drawing/2016/ink" xmlns:am3d="http://schemas.microsoft.com/office/drawing/2017/model3d" xmlns:o="urn:schemas-microsoft-com:office:office" xmlns:oel="http://schemas.microsoft.com/office/2019/extlst" xmlns:r="http://schemas.openxmlformats.org/officeDocument/2006/relationships" xmlns:m="http://schemas.openxmlformats.org/officeDocument/2006/math" xmlns:v="urn:schemas-microsoft-com:vml" xmlns:wp14="http://schemas.microsoft.com/office/word/2010/wordprocessingDrawing" xmlns:wp="http://schemas.openxmlformats.org/drawingml/2006/wordprocessingDrawing" xmlns:w10="urn:schemas-microsoft-com:office:word" xmlns:w="http://schemas.openxmlformats.org/wordprocessingml/2006/main" xmlns:w14="http://schemas.microsoft.com/office/word/2010/wordml" xmlns:w15="http://schemas.microsoft.com/office/word/2012/wordml" xmlns:w16cex="http://schemas.microsoft.com/office/word/2018/wordml/cex" xmlns:w16cid="http://schemas.microsoft.com/office/word/2016/wordml/cid" xmlns:w16="http://schemas.microsoft.com/office/word/2018/wordml" xmlns:w16du="http://schemas.microsoft.com/office/word/2023/wordml/word16du" xmlns:w16sdtdh="http://schemas.microsoft.com/office/word/2020/wordml/sdtdatahash" xmlns:w16sdtfl="http://schemas.microsoft.com/office/word/2024/wordml/sdtformatlock" xmlns:w16se="http://schemas.microsoft.com/office/word/2015/wordml/symex" xmlns:wpg="http://schemas.microsoft.com/office/word/2010/wordprocessingGroup" xmlns:wpi="http://schemas.microsoft.com/office/word/2010/wordprocessingInk" xmlns:wne="http://schemas.microsoft.com/office/word/2006/wordml" xmlns:wps="http://schemas.microsoft.com/office/word/2010/wordprocessingShape" mc:Ignorable="w14 w15 w16se w16cid w16 w16cex w16sdtdh w16sdtfl w16du wp14">
+  <w:p>
+    <w:pPr>
+      <w:pStyle w:val="Header"/>
+    </w:pPr>
+  </w:p>
+</w:hdr>
+</file>
+
+<file path=word/header3.xml><?xml version="1.0" encoding="utf-8"?>
+<w:hdr xmlns:wpc="http://schemas.microsoft.com/office/word/2010/wordprocessingCanvas" xmlns:cx="http://schemas.microsoft.com/office/drawing/2014/chartex" xmlns:cx1="http://schemas.microsoft.com/office/drawing/2015/9/8/chartex" xmlns:cx2="http://schemas.microsoft.com/office/drawing/2015/10/21/chartex" xmlns:cx3="http://schemas.microsoft.com/office/drawing/2016/5/9/chartex" xmlns:cx4="http://schemas.microsoft.com/office/drawing/2016/5/10/chartex" xmlns:cx5="http://schemas.microsoft.com/office/drawing/2016/5/11/chartex" xmlns:cx6="http://schemas.microsoft.com/office/drawing/2016/5/12/chartex" xmlns:cx7="http://schemas.microsoft.com/office/drawing/2016/5/13/chartex" xmlns:cx8="http://schemas.microsoft.com/office/drawing/2016/5/14/chartex" xmlns:mc="http://schemas.openxmlformats.org/markup-compatibility/2006" xmlns:aink="http://schemas.microsoft.com/office/drawing/2016/ink" xmlns:am3d="http://schemas.microsoft.com/office/drawing/2017/model3d" xmlns:o="urn:schemas-microsoft-com:office:office" xmlns:oel="http://schemas.microsoft.com/office/2019/extlst" xmlns:r="http://schemas.openxmlformats.org/officeDocument/2006/relationships" xmlns:m="http://schemas.openxmlformats.org/officeDocument/2006/math" xmlns:v="urn:schemas-microsoft-com:vml" xmlns:wp14="http://schemas.microsoft.com/office/word/2010/wordprocessingDrawing" xmlns:wp="http://schemas.openxmlformats.org/drawingml/2006/wordprocessingDrawing" xmlns:w10="urn:schemas-microsoft-com:office:word" xmlns:w="http://schemas.openxmlformats.org/wordprocessingml/2006/main" xmlns:w14="http://schemas.microsoft.com/office/word/2010/wordml" xmlns:w15="http://schemas.microsoft.com/office/word/2012/wordml" xmlns:w16cex="http://schemas.microsoft.com/office/word/2018/wordml/cex" xmlns:w16cid="http://schemas.microsoft.com/office/word/2016/wordml/cid" xmlns:w16="http://schemas.microsoft.com/office/word/2018/wordml" xmlns:w16du="http://schemas.microsoft.com/office/word/2023/wordml/word16du" xmlns:w16sdtdh="http://schemas.microsoft.com/office/word/2020/wordml/sdtdatahash" xmlns:w16sdtfl="http://schemas.microsoft.com/office/word/2024/wordml/sdtformatlock" xmlns:w16se="http://schemas.microsoft.com/office/word/2015/wordml/symex" xmlns:wpg="http://schemas.microsoft.com/office/word/2010/wordprocessingGroup" xmlns:wpi="http://schemas.microsoft.com/office/word/2010/wordprocessingInk" xmlns:wne="http://schemas.microsoft.com/office/word/2006/wordml" xmlns:wps="http://schemas.microsoft.com/office/word/2010/wordprocessingShape" mc:Ignorable="w14 w15 w16se w16cid w16 w16cex w16sdtdh w16sdtfl w16du wp14">
+  <w:p>
+    <w:pPr>
+      <w:pStyle w:val="Header"/>
+    </w:pPr>
+  </w:p>
+</w:hdr>
+</file>
+
+<file path=word/header4.xml><?xml version="1.0" encoding="utf-8"?>
+<w:hdr xmlns:wpc="http://schemas.microsoft.com/office/word/2010/wordprocessingCanvas" xmlns:cx="http://schemas.microsoft.com/office/drawing/2014/chartex" xmlns:cx1="http://schemas.microsoft.com/office/drawing/2015/9/8/chartex" xmlns:cx2="http://schemas.microsoft.com/office/drawing/2015/10/21/chartex" xmlns:cx3="http://schemas.microsoft.com/office/drawing/2016/5/9/chartex" xmlns:cx4="http://schemas.microsoft.com/office/drawing/2016/5/10/chartex" xmlns:cx5="http://schemas.microsoft.com/office/drawing/2016/5/11/chartex" xmlns:cx6="http://schemas.microsoft.com/office/drawing/2016/5/12/chartex" xmlns:cx7="http://schemas.microsoft.com/office/drawing/2016/5/13/chartex" xmlns:cx8="http://schemas.microsoft.com/office/drawing/2016/5/14/chartex" xmlns:mc="http://schemas.openxmlformats.org/markup-compatibility/2006" xmlns:aink="http://schemas.microsoft.com/office/drawing/2016/ink" xmlns:am3d="http://schemas.microsoft.com/office/drawing/2017/model3d" xmlns:o="urn:schemas-microsoft-com:office:office" xmlns:oel="http://schemas.microsoft.com/office/2019/extlst" xmlns:r="http://schemas.openxmlformats.org/officeDocument/2006/relationships" xmlns:m="http://schemas.openxmlformats.org/officeDocument/2006/math" xmlns:v="urn:schemas-microsoft-com:vml" xmlns:wp14="http://schemas.microsoft.com/office/word/2010/wordprocessingDrawing" xmlns:wp="http://schemas.openxmlformats.org/drawingml/2006/wordprocessingDrawing" xmlns:w10="urn:schemas-microsoft-com:office:word" xmlns:w="http://schemas.openxmlformats.org/wordprocessingml/2006/main" xmlns:w14="http://schemas.microsoft.com/office/word/2010/wordml" xmlns:w15="http://schemas.microsoft.com/office/word/2012/wordml" xmlns:w16cex="http://schemas.microsoft.com/office/word/2018/wordml/cex" xmlns:w16cid="http://schemas.microsoft.com/office/word/2016/wordml/cid" xmlns:w16="http://schemas.microsoft.com/office/word/2018/wordml" xmlns:w16du="http://schemas.microsoft.com/office/word/2023/wordml/word16du" xmlns:w16sdtdh="http://schemas.microsoft.com/office/word/2020/wordml/sdtdatahash" xmlns:w16sdtfl="http://schemas.microsoft.com/office/word/2024/wordml/sdtformatlock" xmlns:w16se="http://schemas.microsoft.com/office/word/2015/wordml/symex" xmlns:wpg="http://schemas.microsoft.com/office/word/2010/wordprocessingGroup" xmlns:wpi="http://schemas.microsoft.com/office/word/2010/wordprocessingInk" xmlns:wne="http://schemas.microsoft.com/office/word/2006/wordml" xmlns:wps="http://schemas.microsoft.com/office/word/2010/wordprocessingShape" mc:Ignorable="w14 w15 w16se w16cid w16 w16cex w16sdtdh w16sdtfl w16du wp14">
+  <w:p>
+    <w:pPr>
       <w:pBdr>
         <w:bottom w:val="single" w:sz="4" w:space="1" w:color="auto"/>
       </w:pBdr>
@@ -3982,7 +4037,17 @@
         <w:szCs w:val="36"/>
         <w:cs/>
       </w:rPr>
-      <w:t>ครั้งที่ 1</w:t>
+      <w:t xml:space="preserve">ครั้งที่ </w:t>
+    </w:r>
+    <w:r>
+      <w:rPr>
+        <w:rFonts w:ascii="TH SarabunPSK" w:hAnsi="TH SarabunPSK" w:cs="TH SarabunPSK"/>
+        <w:b/>
+        <w:bCs/>
+        <w:sz w:val="36"/>
+        <w:szCs w:val="36"/>
+      </w:rPr>
+      <w:t>2</w:t>
     </w:r>
     <w:r>
       <w:rPr>
@@ -4654,6 +4719,7 @@
   <w:style w:type="character" w:default="1" w:styleId="DefaultParagraphFont">
     <w:name w:val="Default Paragraph Font"/>
     <w:uiPriority w:val="1"/>
+    <w:semiHidden/>
     <w:unhideWhenUsed/>
   </w:style>
   <w:style w:type="table" w:default="1" w:styleId="TableNormal">
@@ -5335,15 +5401,6 @@
 </file>
 
 <file path=customXml/item2.xml><?xml version="1.0" encoding="utf-8"?>
-<?mso-contentType ?>
-<FormTemplates xmlns="http://schemas.microsoft.com/sharepoint/v3/contenttype/forms">
-  <Display>DocumentLibraryForm</Display>
-  <Edit>DocumentLibraryForm</Edit>
-  <New>DocumentLibraryForm</New>
-</FormTemplates>
-</file>
-
-<file path=customXml/item3.xml><?xml version="1.0" encoding="utf-8"?>
 <ct:contentTypeSchema xmlns:ct="http://schemas.microsoft.com/office/2006/metadata/contentType" xmlns:ma="http://schemas.microsoft.com/office/2006/metadata/properties/metaAttributes" ct:_="" ma:_="" ma:contentTypeName="Document" ma:contentTypeID="0x0101008B15834F96E1534C9DFE4652D9BF3F0A" ma:contentTypeVersion="0" ma:contentTypeDescription="Create a new document." ma:contentTypeScope="" ma:versionID="8acd3d498b49945e870955d1a3191627">
   <xsd:schema xmlns:xsd="http://www.w3.org/2001/XMLSchema" xmlns:xs="http://www.w3.org/2001/XMLSchema" xmlns:p="http://schemas.microsoft.com/office/2006/metadata/properties" targetNamespace="http://schemas.microsoft.com/office/2006/metadata/properties" ma:root="true" ma:fieldsID="500c6692915ba10984c0aabd49f31b22">
     <xsd:element name="properties">
@@ -5457,6 +5514,15 @@
 </ct:contentTypeSchema>
 </file>
 
+<file path=customXml/item3.xml><?xml version="1.0" encoding="utf-8"?>
+<?mso-contentType ?>
+<FormTemplates xmlns="http://schemas.microsoft.com/sharepoint/v3/contenttype/forms">
+  <Display>DocumentLibraryForm</Display>
+  <Edit>DocumentLibraryForm</Edit>
+  <New>DocumentLibraryForm</New>
+</FormTemplates>
+</file>
+
 <file path=customXml/itemProps1.xml><?xml version="1.0" encoding="utf-8"?>
 <ds:datastoreItem xmlns:ds="http://schemas.openxmlformats.org/officeDocument/2006/customXml" ds:itemID="{E10EF22D-DBB9-4252-A375-871CFAD337E1}">
   <ds:schemaRefs>
@@ -5467,14 +5533,6 @@
 </file>
 
 <file path=customXml/itemProps2.xml><?xml version="1.0" encoding="utf-8"?>
-<ds:datastoreItem xmlns:ds="http://schemas.openxmlformats.org/officeDocument/2006/customXml" ds:itemID="{AE725E6C-80C5-4D59-852A-461117A6EC00}">
-  <ds:schemaRefs>
-    <ds:schemaRef ds:uri="http://schemas.microsoft.com/sharepoint/v3/contenttype/forms"/>
-  </ds:schemaRefs>
-</ds:datastoreItem>
-</file>
-
-<file path=customXml/itemProps3.xml><?xml version="1.0" encoding="utf-8"?>
 <ds:datastoreItem xmlns:ds="http://schemas.openxmlformats.org/officeDocument/2006/customXml" ds:itemID="{8C274BF9-D633-4BB5-AE0F-8092946F3A9F}">
   <ds:schemaRefs>
     <ds:schemaRef ds:uri="http://schemas.microsoft.com/office/2006/metadata/contentType"/>
@@ -5488,4 +5546,12 @@
     <ds:schemaRef ds:uri="http://schemas.microsoft.com/office/infopath/2007/PartnerControls"/>
   </ds:schemaRefs>
 </ds:datastoreItem>
+</file>
+
+<file path=customXml/itemProps3.xml><?xml version="1.0" encoding="utf-8"?>
+<ds:datastoreItem xmlns:ds="http://schemas.openxmlformats.org/officeDocument/2006/customXml" ds:itemID="{AE725E6C-80C5-4D59-852A-461117A6EC00}">
+  <ds:schemaRefs>
+    <ds:schemaRef ds:uri="http://schemas.microsoft.com/sharepoint/v3/contenttype/forms"/>
+  </ds:schemaRefs>
+</ds:datastoreItem>
 </file>
</xml_diff>